<commit_message>
fix(submission): sync P6/P7/P8 packages to reconciled manuscripts
The submission packages held SEPARATE blinded-manuscript copies that
predated this session's reconciliation. Fixed:
- P7 ibr_package (IBR is now P7's target): manuscript was fully stale
  (84,910/38,342/TP 40%/28-55 gradient, 0 canonical). Re-blinded from the
  reconciled working copy -> 0 stale, 16 canonical tokens, three-zone +
  DAI level-shifter; author identifiers stripped.
- P6 live packages (jwb primary -> jim -> apjm; IBR deprecated for P6):
  cDAI Q_M typo 1.34/p=.513 -> 1.23/p=.541 (verified .513 only co-occurs
  with cDAI before replacing). Reverted the misdirected edit to the
  DEPRECATED p6/ibr_package.
- P8 world_development_package: manuscript current (FIP/959); added
  AI-use disclosure to the title page.
Rebuilt all affected docx. P9 mir_package already current with disclosure.
</commit_message>
<xml_diff>
--- a/p8/submission/world_development_package/02_title_page.docx
+++ b/p8/submission/world_development_package/02_title_page.docx
@@ -572,9 +572,30 @@
         <w:t xml:space="preserve">forced internationalization; small island developing states; internationalization–performance relationship; institutional voids; Pacific economies; labor productivity; Forced Internationalization Penalty (FIP)</w:t>
       </w:r>
     </w:p>
+    <w:p>
+      <w:pPr>
+        <w:pStyle w:val="BodyText"/>
+      </w:pPr>
+      <w:r>
+        <w:rPr>
+          <w:bCs/>
+          <w:b/>
+        </w:rPr>
+        <w:t xml:space="preserve">AI-use disclosure.</w:t>
+      </w:r>
+      <w:r>
+        <w:t xml:space="preserve"> </w:t>
+      </w:r>
+      <w:r>
+        <w:t xml:space="preserve">Generative-AI tools were used to assist with prose drafting, code refactoring, and language editing. All research design, variable construction, model specification, estimation, interpretation, and scientific conclusions are the authors' own work and responsibility; no result was accepted on an AI's assertion, and all reported quantitative results are reproducible from the accompanying scripts.</w:t>
+      </w:r>
+    </w:p>
     <w:bookmarkEnd w:id="26"/>
     <w:bookmarkEnd w:id="27"/>
-    <w:sectPr/>
+    <w:sectPr>
+      <w:pgSz w:h="16838" w:w="11906"/>
+      <w:pgMar w:bottom="1417" w:left="1417" w:right="1417" w:top="1417"/>
+    </w:sectPr>
   </w:body>
 </w:document>
 </file>
@@ -707,29 +728,59 @@
   <w:style w:default="1" w:styleId="Normal" w:type="paragraph">
     <w:name w:val="Normal"/>
     <w:qFormat/>
+    <w:pPr>
+      <w:spacing w:line="276" w:lineRule="auto"/>
+      <w:jc w:val="both"/>
+    </w:pPr>
+    <w:rPr>
+      <w:rFonts w:ascii="Times New Roman" w:eastAsia="Times New Roman" w:hAnsi="Times New Roman"/>
+      <w:color w:val="000000"/>
+      <w:sz w:val="24"/>
+    </w:rPr>
   </w:style>
   <w:style w:styleId="BodyText" w:type="paragraph">
     <w:name w:val="Body Text"/>
     <w:basedOn w:val="Normal"/>
     <w:link w:val="BodyTextChar"/>
     <w:pPr>
-      <w:spacing w:after="180" w:before="180"/>
-    </w:pPr>
-    <w:qFormat/>
+      <w:spacing w:after="180" w:before="180" w:line="276" w:lineRule="auto"/>
+      <w:jc w:val="both"/>
+    </w:pPr>
+    <w:qFormat/>
+    <w:rPr>
+      <w:rFonts w:ascii="Times New Roman" w:eastAsia="Times New Roman" w:hAnsi="Times New Roman"/>
+      <w:color w:val="000000"/>
+      <w:sz w:val="24"/>
+    </w:rPr>
   </w:style>
   <w:style w:customStyle="1" w:styleId="FirstParagraph" w:type="paragraph">
     <w:name w:val="First Paragraph"/>
     <w:basedOn w:val="BodyText"/>
     <w:next w:val="BodyText"/>
     <w:qFormat/>
+    <w:pPr>
+      <w:spacing w:line="276" w:lineRule="auto"/>
+      <w:jc w:val="both"/>
+    </w:pPr>
+    <w:rPr>
+      <w:rFonts w:ascii="Times New Roman" w:eastAsia="Times New Roman" w:hAnsi="Times New Roman"/>
+      <w:color w:val="000000"/>
+      <w:sz w:val="24"/>
+    </w:rPr>
   </w:style>
   <w:style w:customStyle="1" w:styleId="Compact" w:type="paragraph">
     <w:name w:val="Compact"/>
     <w:basedOn w:val="BodyText"/>
     <w:qFormat/>
     <w:pPr>
-      <w:spacing w:after="36" w:before="36"/>
-    </w:pPr>
+      <w:spacing w:after="36" w:before="36" w:line="276" w:lineRule="auto"/>
+      <w:jc w:val="both"/>
+    </w:pPr>
+    <w:rPr>
+      <w:rFonts w:ascii="Times New Roman" w:eastAsia="Times New Roman" w:hAnsi="Times New Roman"/>
+      <w:color w:val="000000"/>
+      <w:sz w:val="24"/>
+    </w:rPr>
   </w:style>
   <w:style w:styleId="Title" w:type="paragraph">
     <w:name w:val="Title"/>
@@ -739,15 +790,15 @@
     <w:pPr>
       <w:keepNext/>
       <w:keepLines/>
-      <w:spacing w:after="240" w:before="480"/>
-      <w:jc w:val="center"/>
-    </w:pPr>
-    <w:rPr>
-      <w:rFonts w:asciiTheme="majorHAnsi" w:cstheme="majorBidi" w:eastAsiaTheme="majorEastAsia" w:hAnsiTheme="majorHAnsi"/>
+      <w:spacing w:after="240" w:before="480" w:line="276" w:lineRule="auto"/>
+      <w:jc w:val="both"/>
+    </w:pPr>
+    <w:rPr>
+      <w:rFonts w:ascii="Times New Roman" w:asciiTheme="majorHAnsi" w:cstheme="majorBidi" w:eastAsia="Times New Roman" w:eastAsiaTheme="majorEastAsia" w:hAnsi="Times New Roman" w:hAnsiTheme="majorHAnsi"/>
       <w:b/>
       <w:bCs/>
-      <w:color w:themeColor="accent1" w:themeShade="B5" w:val="345A8A"/>
-      <w:sz w:val="36"/>
+      <w:color w:val="000000"/>
+      <w:sz w:val="24"/>
       <w:szCs w:val="36"/>
     </w:rPr>
   </w:style>
@@ -759,11 +810,13 @@
     <w:pPr>
       <w:keepNext/>
       <w:keepLines/>
-      <w:spacing w:after="240" w:before="240"/>
-      <w:jc w:val="center"/>
-    </w:pPr>
-    <w:rPr>
-      <w:sz w:val="30"/>
+      <w:spacing w:after="240" w:before="240" w:line="276" w:lineRule="auto"/>
+      <w:jc w:val="both"/>
+    </w:pPr>
+    <w:rPr>
+      <w:rFonts w:ascii="Times New Roman" w:eastAsia="Times New Roman" w:hAnsi="Times New Roman"/>
+      <w:color w:val="000000"/>
+      <w:sz w:val="24"/>
       <w:szCs w:val="30"/>
     </w:rPr>
   </w:style>
@@ -774,8 +827,14 @@
     <w:pPr>
       <w:keepNext/>
       <w:keepLines/>
-      <w:jc w:val="center"/>
-    </w:pPr>
+      <w:spacing w:line="276" w:lineRule="auto"/>
+      <w:jc w:val="both"/>
+    </w:pPr>
+    <w:rPr>
+      <w:rFonts w:ascii="Times New Roman" w:eastAsia="Times New Roman" w:hAnsi="Times New Roman"/>
+      <w:color w:val="000000"/>
+      <w:sz w:val="24"/>
+    </w:rPr>
   </w:style>
   <w:style w:styleId="Date" w:type="paragraph">
     <w:name w:val="Date"/>
@@ -784,8 +843,14 @@
     <w:pPr>
       <w:keepNext/>
       <w:keepLines/>
-      <w:jc w:val="center"/>
-    </w:pPr>
+      <w:spacing w:line="276" w:lineRule="auto"/>
+      <w:jc w:val="both"/>
+    </w:pPr>
+    <w:rPr>
+      <w:rFonts w:ascii="Times New Roman" w:eastAsia="Times New Roman" w:hAnsi="Times New Roman"/>
+      <w:color w:val="000000"/>
+      <w:sz w:val="24"/>
+    </w:rPr>
   </w:style>
   <w:style w:customStyle="1" w:styleId="AbstractTitle" w:type="paragraph">
     <w:name w:val="Abstract Title"/>
@@ -795,15 +860,15 @@
     <w:pPr>
       <w:keepNext/>
       <w:keepLines/>
-      <w:jc w:val="center"/>
-      <w:spacing w:after="0" w:before="300"/>
-    </w:pPr>
-    <w:rPr>
-      <w:sz w:val="20"/>
+      <w:jc w:val="both"/>
+      <w:spacing w:after="0" w:before="300" w:line="276" w:lineRule="auto"/>
+    </w:pPr>
+    <w:rPr>
+      <w:color w:val="000000"/>
+      <w:sz w:val="24"/>
       <w:szCs w:val="20"/>
+      <w:rFonts w:ascii="Times New Roman" w:eastAsia="Times New Roman" w:hAnsi="Times New Roman"/>
       <w:b/>
-      <w:color w:val="345A8A"/>
-      &gt;
     </w:rPr>
   </w:style>
   <w:style w:customStyle="1" w:styleId="Abstract" w:type="paragraph">
@@ -814,10 +879,13 @@
     <w:pPr>
       <w:keepNext/>
       <w:keepLines/>
-      <w:spacing w:after="300" w:before="100"/>
-    </w:pPr>
-    <w:rPr>
-      <w:sz w:val="20"/>
+      <w:spacing w:after="300" w:before="100" w:line="276" w:lineRule="auto"/>
+      <w:jc w:val="both"/>
+    </w:pPr>
+    <w:rPr>
+      <w:rFonts w:ascii="Times New Roman" w:eastAsia="Times New Roman" w:hAnsi="Times New Roman"/>
+      <w:color w:val="000000"/>
+      <w:sz w:val="24"/>
       <w:szCs w:val="20"/>
     </w:rPr>
   </w:style>
@@ -826,8 +894,15 @@
     <w:basedOn w:val="Normal"/>
     <w:next w:val="Bibliography"/>
     <w:qFormat/>
-    <w:pPr/>
-    <w:rPr/>
+    <w:pPr>
+      <w:spacing w:line="276" w:lineRule="auto"/>
+      <w:jc w:val="both"/>
+    </w:pPr>
+    <w:rPr>
+      <w:rFonts w:ascii="Times New Roman" w:eastAsia="Times New Roman" w:hAnsi="Times New Roman"/>
+      <w:color w:val="000000"/>
+      <w:sz w:val="24"/>
+    </w:rPr>
   </w:style>
   <w:style w:styleId="Heading1" w:type="paragraph">
     <w:name w:val="Heading 1"/>
@@ -838,15 +913,16 @@
     <w:pPr>
       <w:keepNext/>
       <w:keepLines/>
-      <w:spacing w:after="0" w:before="480"/>
+      <w:spacing w:after="0" w:before="480" w:line="276" w:lineRule="auto"/>
+      <w:jc w:val="both"/>
       <w:outlineLvl w:val="0"/>
     </w:pPr>
     <w:rPr>
-      <w:rFonts w:asciiTheme="majorHAnsi" w:cstheme="majorBidi" w:eastAsiaTheme="majorEastAsia" w:hAnsiTheme="majorHAnsi"/>
+      <w:rFonts w:ascii="Times New Roman" w:asciiTheme="majorHAnsi" w:cstheme="majorBidi" w:eastAsia="Times New Roman" w:eastAsiaTheme="majorEastAsia" w:hAnsi="Times New Roman" w:hAnsiTheme="majorHAnsi"/>
       <w:b/>
       <w:bCs/>
-      <w:color w:themeColor="accent1" w:val="4F81BD"/>
-      <w:sz w:val="32"/>
+      <w:color w:val="000000"/>
+      <w:sz w:val="24"/>
       <w:szCs w:val="32"/>
     </w:rPr>
   </w:style>
@@ -860,15 +936,16 @@
     <w:pPr>
       <w:keepNext/>
       <w:keepLines/>
-      <w:spacing w:after="0" w:before="200"/>
+      <w:spacing w:after="0" w:before="200" w:line="276" w:lineRule="auto"/>
+      <w:jc w:val="both"/>
       <w:outlineLvl w:val="1"/>
     </w:pPr>
     <w:rPr>
-      <w:rFonts w:asciiTheme="majorHAnsi" w:cstheme="majorBidi" w:eastAsiaTheme="majorEastAsia" w:hAnsiTheme="majorHAnsi"/>
+      <w:rFonts w:ascii="Times New Roman" w:asciiTheme="majorHAnsi" w:cstheme="majorBidi" w:eastAsia="Times New Roman" w:eastAsiaTheme="majorEastAsia" w:hAnsi="Times New Roman" w:hAnsiTheme="majorHAnsi"/>
       <w:b/>
       <w:bCs/>
-      <w:color w:themeColor="accent1" w:val="4F81BD"/>
-      <w:sz w:val="28"/>
+      <w:color w:val="000000"/>
+      <w:sz w:val="24"/>
       <w:szCs w:val="28"/>
     </w:rPr>
   </w:style>
@@ -882,14 +959,15 @@
     <w:pPr>
       <w:keepNext/>
       <w:keepLines/>
-      <w:spacing w:after="0" w:before="200"/>
+      <w:spacing w:after="0" w:before="200" w:line="276" w:lineRule="auto"/>
+      <w:jc w:val="both"/>
       <w:outlineLvl w:val="2"/>
     </w:pPr>
     <w:rPr>
-      <w:rFonts w:asciiTheme="majorHAnsi" w:cstheme="majorBidi" w:eastAsiaTheme="majorEastAsia" w:hAnsiTheme="majorHAnsi"/>
+      <w:rFonts w:ascii="Times New Roman" w:asciiTheme="majorHAnsi" w:cstheme="majorBidi" w:eastAsia="Times New Roman" w:eastAsiaTheme="majorEastAsia" w:hAnsi="Times New Roman" w:hAnsiTheme="majorHAnsi"/>
       <w:b/>
       <w:bCs/>
-      <w:color w:themeColor="accent1" w:val="4F81BD"/>
+      <w:color w:val="000000"/>
       <w:sz w:val="24"/>
       <w:szCs w:val="24"/>
     </w:rPr>
@@ -904,14 +982,15 @@
     <w:pPr>
       <w:keepNext/>
       <w:keepLines/>
-      <w:spacing w:after="0" w:before="200"/>
+      <w:spacing w:after="0" w:before="200" w:line="276" w:lineRule="auto"/>
+      <w:jc w:val="both"/>
       <w:outlineLvl w:val="3"/>
     </w:pPr>
     <w:rPr>
-      <w:rFonts w:asciiTheme="majorHAnsi" w:cstheme="majorBidi" w:eastAsiaTheme="majorEastAsia" w:hAnsiTheme="majorHAnsi"/>
+      <w:rFonts w:ascii="Times New Roman" w:asciiTheme="majorHAnsi" w:cstheme="majorBidi" w:eastAsia="Times New Roman" w:eastAsiaTheme="majorEastAsia" w:hAnsi="Times New Roman" w:hAnsiTheme="majorHAnsi"/>
       <w:i/>
       <w:bCs/>
-      <w:color w:themeColor="accent1" w:val="4F81BD"/>
+      <w:color w:val="000000"/>
       <w:sz w:val="24"/>
       <w:szCs w:val="24"/>
     </w:rPr>
@@ -926,13 +1005,14 @@
     <w:pPr>
       <w:keepNext/>
       <w:keepLines/>
-      <w:spacing w:after="0" w:before="200"/>
+      <w:spacing w:after="0" w:before="200" w:line="276" w:lineRule="auto"/>
+      <w:jc w:val="both"/>
       <w:outlineLvl w:val="4"/>
     </w:pPr>
     <w:rPr>
-      <w:rFonts w:asciiTheme="majorHAnsi" w:cstheme="majorBidi" w:eastAsiaTheme="majorEastAsia" w:hAnsiTheme="majorHAnsi"/>
+      <w:rFonts w:ascii="Times New Roman" w:asciiTheme="majorHAnsi" w:cstheme="majorBidi" w:eastAsia="Times New Roman" w:eastAsiaTheme="majorEastAsia" w:hAnsi="Times New Roman" w:hAnsiTheme="majorHAnsi"/>
       <w:iCs/>
-      <w:color w:themeColor="accent1" w:val="4F81BD"/>
+      <w:color w:val="000000"/>
       <w:sz w:val="24"/>
       <w:szCs w:val="24"/>
     </w:rPr>
@@ -947,12 +1027,13 @@
     <w:pPr>
       <w:keepNext/>
       <w:keepLines/>
-      <w:spacing w:after="0" w:before="200"/>
+      <w:spacing w:after="0" w:before="200" w:line="276" w:lineRule="auto"/>
+      <w:jc w:val="both"/>
       <w:outlineLvl w:val="5"/>
     </w:pPr>
     <w:rPr>
-      <w:rFonts w:asciiTheme="majorHAnsi" w:cstheme="majorBidi" w:eastAsiaTheme="majorEastAsia" w:hAnsiTheme="majorHAnsi"/>
-      <w:color w:themeColor="accent1" w:val="4F81BD"/>
+      <w:rFonts w:ascii="Times New Roman" w:asciiTheme="majorHAnsi" w:cstheme="majorBidi" w:eastAsia="Times New Roman" w:eastAsiaTheme="majorEastAsia" w:hAnsi="Times New Roman" w:hAnsiTheme="majorHAnsi"/>
+      <w:color w:val="000000"/>
       <w:sz w:val="24"/>
       <w:szCs w:val="24"/>
     </w:rPr>
@@ -967,12 +1048,13 @@
     <w:pPr>
       <w:keepNext/>
       <w:keepLines/>
-      <w:spacing w:after="0" w:before="200"/>
+      <w:spacing w:after="0" w:before="200" w:line="276" w:lineRule="auto"/>
+      <w:jc w:val="both"/>
       <w:outlineLvl w:val="6"/>
     </w:pPr>
     <w:rPr>
-      <w:rFonts w:asciiTheme="majorHAnsi" w:cstheme="majorBidi" w:eastAsiaTheme="majorEastAsia" w:hAnsiTheme="majorHAnsi"/>
-      <w:color w:themeColor="accent1" w:val="4F81BD"/>
+      <w:rFonts w:ascii="Times New Roman" w:asciiTheme="majorHAnsi" w:cstheme="majorBidi" w:eastAsia="Times New Roman" w:eastAsiaTheme="majorEastAsia" w:hAnsi="Times New Roman" w:hAnsiTheme="majorHAnsi"/>
+      <w:color w:val="000000"/>
       <w:sz w:val="24"/>
       <w:szCs w:val="24"/>
     </w:rPr>
@@ -987,12 +1069,13 @@
     <w:pPr>
       <w:keepNext/>
       <w:keepLines/>
-      <w:spacing w:after="0" w:before="200"/>
+      <w:spacing w:after="0" w:before="200" w:line="276" w:lineRule="auto"/>
+      <w:jc w:val="both"/>
       <w:outlineLvl w:val="7"/>
     </w:pPr>
     <w:rPr>
-      <w:rFonts w:asciiTheme="majorHAnsi" w:cstheme="majorBidi" w:eastAsiaTheme="majorEastAsia" w:hAnsiTheme="majorHAnsi"/>
-      <w:color w:themeColor="accent1" w:val="4F81BD"/>
+      <w:rFonts w:ascii="Times New Roman" w:asciiTheme="majorHAnsi" w:cstheme="majorBidi" w:eastAsia="Times New Roman" w:eastAsiaTheme="majorEastAsia" w:hAnsi="Times New Roman" w:hAnsiTheme="majorHAnsi"/>
+      <w:color w:val="000000"/>
       <w:sz w:val="24"/>
       <w:szCs w:val="24"/>
     </w:rPr>
@@ -1007,12 +1090,13 @@
     <w:pPr>
       <w:keepNext/>
       <w:keepLines/>
-      <w:spacing w:after="0" w:before="200"/>
+      <w:spacing w:after="0" w:before="200" w:line="276" w:lineRule="auto"/>
+      <w:jc w:val="both"/>
       <w:outlineLvl w:val="8"/>
     </w:pPr>
     <w:rPr>
-      <w:rFonts w:asciiTheme="majorHAnsi" w:cstheme="majorBidi" w:eastAsiaTheme="majorEastAsia" w:hAnsiTheme="majorHAnsi"/>
-      <w:color w:themeColor="accent1" w:val="4F81BD"/>
+      <w:rFonts w:ascii="Times New Roman" w:asciiTheme="majorHAnsi" w:cstheme="majorBidi" w:eastAsia="Times New Roman" w:eastAsiaTheme="majorEastAsia" w:hAnsi="Times New Roman" w:hAnsiTheme="majorHAnsi"/>
+      <w:color w:val="000000"/>
       <w:sz w:val="24"/>
       <w:szCs w:val="24"/>
     </w:rPr>
@@ -1025,9 +1109,15 @@
     <w:unhideWhenUsed/>
     <w:qFormat/>
     <w:pPr>
-      <w:spacing w:after="100" w:before="100"/>
+      <w:spacing w:after="100" w:before="100" w:line="276" w:lineRule="auto"/>
       <w:ind w:firstLine="0" w:left="480" w:right="480"/>
-    </w:pPr>
+      <w:jc w:val="both"/>
+    </w:pPr>
+    <w:rPr>
+      <w:rFonts w:ascii="Times New Roman" w:eastAsia="Times New Roman" w:hAnsi="Times New Roman"/>
+      <w:color w:val="000000"/>
+      <w:sz w:val="24"/>
+    </w:rPr>
   </w:style>
   <w:style w:styleId="FootnoteText" w:type="paragraph">
     <w:name w:val="Footnote Text"/>
@@ -1036,11 +1126,25 @@
     <w:uiPriority w:val="9"/>
     <w:unhideWhenUsed/>
     <w:qFormat/>
+    <w:pPr>
+      <w:spacing w:line="276" w:lineRule="auto"/>
+      <w:jc w:val="both"/>
+    </w:pPr>
+    <w:rPr>
+      <w:rFonts w:ascii="Times New Roman" w:eastAsia="Times New Roman" w:hAnsi="Times New Roman"/>
+      <w:color w:val="000000"/>
+      <w:sz w:val="24"/>
+    </w:rPr>
   </w:style>
   <w:style w:default="1" w:styleId="DefaultParagraphFont" w:type="character">
     <w:name w:val="Default Paragraph Font"/>
     <w:semiHidden/>
     <w:unhideWhenUsed/>
+    <w:rPr>
+      <w:rFonts w:ascii="Times New Roman" w:eastAsia="Times New Roman" w:hAnsi="Times New Roman"/>
+      <w:color w:val="000000"/>
+      <w:sz w:val="24"/>
+    </w:rPr>
   </w:style>
   <w:style w:default="1" w:styleId="Table" w:type="table">
     <w:name w:val="Table"/>
@@ -1048,6 +1152,15 @@
     <w:semiHidden/>
     <w:unhideWhenUsed/>
     <w:qFormat/>
+    <w:pPr>
+      <w:spacing w:line="276" w:lineRule="auto"/>
+      <w:jc w:val="both"/>
+    </w:pPr>
+    <w:rPr>
+      <w:rFonts w:ascii="Times New Roman" w:eastAsia="Times New Roman" w:hAnsi="Times New Roman"/>
+      <w:color w:val="000000"/>
+      <w:sz w:val="24"/>
+    </w:rPr>
     <w:tblPr>
       <w:tblInd w:type="dxa" w:w="0"/>
       <w:tblCellMar>
@@ -1080,25 +1193,42 @@
     <w:pPr>
       <w:keepNext/>
       <w:keepLines/>
-      <w:spacing w:after="0"/>
-    </w:pPr>
-    <w:rPr>
+      <w:spacing w:after="0" w:line="276" w:lineRule="auto"/>
+      <w:jc w:val="both"/>
+    </w:pPr>
+    <w:rPr>
+      <w:rFonts w:ascii="Times New Roman" w:eastAsia="Times New Roman" w:hAnsi="Times New Roman"/>
       <w:b/>
+      <w:color w:val="000000"/>
+      <w:sz w:val="24"/>
     </w:rPr>
   </w:style>
   <w:style w:customStyle="1" w:styleId="Definition" w:type="paragraph">
     <w:name w:val="Definition"/>
     <w:basedOn w:val="Normal"/>
+    <w:pPr>
+      <w:spacing w:line="276" w:lineRule="auto"/>
+      <w:jc w:val="both"/>
+    </w:pPr>
+    <w:rPr>
+      <w:rFonts w:ascii="Times New Roman" w:eastAsia="Times New Roman" w:hAnsi="Times New Roman"/>
+      <w:color w:val="000000"/>
+      <w:sz w:val="24"/>
+    </w:rPr>
   </w:style>
   <w:style w:styleId="Caption" w:type="paragraph">
     <w:name w:val="Caption"/>
     <w:basedOn w:val="Normal"/>
     <w:link w:val="BodyTextChar"/>
     <w:pPr>
-      <w:spacing w:after="120" w:before="0"/>
-    </w:pPr>
-    <w:rPr>
+      <w:spacing w:after="120" w:before="0" w:line="276" w:lineRule="auto"/>
+      <w:jc w:val="both"/>
+    </w:pPr>
+    <w:rPr>
+      <w:rFonts w:ascii="Times New Roman" w:eastAsia="Times New Roman" w:hAnsi="Times New Roman"/>
       <w:i/>
+      <w:color w:val="000000"/>
+      <w:sz w:val="24"/>
     </w:rPr>
   </w:style>
   <w:style w:customStyle="1" w:styleId="TableCaption" w:type="paragraph">
@@ -1106,44 +1236,90 @@
     <w:basedOn w:val="Caption"/>
     <w:pPr>
       <w:keepNext/>
-    </w:pPr>
+      <w:spacing w:line="276" w:lineRule="auto"/>
+      <w:jc w:val="both"/>
+    </w:pPr>
+    <w:rPr>
+      <w:rFonts w:ascii="Times New Roman" w:eastAsia="Times New Roman" w:hAnsi="Times New Roman"/>
+      <w:color w:val="000000"/>
+      <w:sz w:val="24"/>
+    </w:rPr>
   </w:style>
   <w:style w:customStyle="1" w:styleId="ImageCaption" w:type="paragraph">
     <w:name w:val="Image Caption"/>
     <w:basedOn w:val="Caption"/>
+    <w:pPr>
+      <w:spacing w:line="276" w:lineRule="auto"/>
+      <w:jc w:val="both"/>
+    </w:pPr>
+    <w:rPr>
+      <w:rFonts w:ascii="Times New Roman" w:eastAsia="Times New Roman" w:hAnsi="Times New Roman"/>
+      <w:color w:val="000000"/>
+      <w:sz w:val="24"/>
+    </w:rPr>
   </w:style>
   <w:style w:customStyle="1" w:styleId="Figure" w:type="paragraph">
     <w:name w:val="Figure"/>
     <w:basedOn w:val="Normal"/>
+    <w:pPr>
+      <w:spacing w:line="276" w:lineRule="auto"/>
+      <w:jc w:val="both"/>
+    </w:pPr>
+    <w:rPr>
+      <w:rFonts w:ascii="Times New Roman" w:eastAsia="Times New Roman" w:hAnsi="Times New Roman"/>
+      <w:color w:val="000000"/>
+      <w:sz w:val="24"/>
+    </w:rPr>
   </w:style>
   <w:style w:customStyle="1" w:styleId="CaptionedFigure" w:type="paragraph">
     <w:name w:val="Captioned Figure"/>
     <w:basedOn w:val="Figure"/>
     <w:pPr>
       <w:keepNext/>
-    </w:pPr>
+      <w:spacing w:line="276" w:lineRule="auto"/>
+      <w:jc w:val="both"/>
+    </w:pPr>
+    <w:rPr>
+      <w:rFonts w:ascii="Times New Roman" w:eastAsia="Times New Roman" w:hAnsi="Times New Roman"/>
+      <w:color w:val="000000"/>
+      <w:sz w:val="24"/>
+    </w:rPr>
   </w:style>
   <w:style w:customStyle="1" w:styleId="BodyTextChar" w:type="character">
     <w:name w:val="Body Text Char"/>
     <w:basedOn w:val="DefaultParagraphFont"/>
     <w:link w:val="BodyText"/>
+    <w:rPr>
+      <w:rFonts w:ascii="Times New Roman" w:eastAsia="Times New Roman" w:hAnsi="Times New Roman"/>
+      <w:color w:val="000000"/>
+      <w:sz w:val="24"/>
+    </w:rPr>
   </w:style>
   <w:style w:customStyle="1" w:styleId="VerbatimChar" w:type="character">
     <w:name w:val="Verbatim Char"/>
     <w:basedOn w:val="BodyTextChar"/>
     <w:rPr>
-      <w:rFonts w:ascii="Consolas" w:hAnsi="Consolas"/>
-      <w:sz w:val="22"/>
+      <w:rFonts w:ascii="Times New Roman" w:eastAsia="Times New Roman" w:hAnsi="Times New Roman"/>
+      <w:color w:val="000000"/>
+      <w:sz w:val="24"/>
     </w:rPr>
   </w:style>
   <w:style w:customStyle="1" w:styleId="SectionNumber" w:type="character">
     <w:name w:val="Section Number"/>
     <w:basedOn w:val="BodyTextChar"/>
+    <w:rPr>
+      <w:rFonts w:ascii="Times New Roman" w:eastAsia="Times New Roman" w:hAnsi="Times New Roman"/>
+      <w:color w:val="000000"/>
+      <w:sz w:val="24"/>
+    </w:rPr>
   </w:style>
   <w:style w:styleId="FootnoteReference" w:type="character">
     <w:name w:val="Footnote Reference"/>
     <w:basedOn w:val="BodyTextChar"/>
     <w:rPr>
+      <w:rFonts w:ascii="Times New Roman" w:eastAsia="Times New Roman" w:hAnsi="Times New Roman"/>
+      <w:color w:val="000000"/>
+      <w:sz w:val="24"/>
       <w:vertAlign w:val="superscript"/>
     </w:rPr>
   </w:style>
@@ -1151,7 +1327,9 @@
     <w:name w:val="Hyperlink"/>
     <w:basedOn w:val="BodyTextChar"/>
     <w:rPr>
-      <w:color w:themeColor="accent1" w:val="4F81BD"/>
+      <w:rFonts w:ascii="Times New Roman" w:eastAsia="Times New Roman" w:hAnsi="Times New Roman"/>
+      <w:color w:val="000000"/>
+      <w:sz w:val="24"/>
     </w:rPr>
   </w:style>
   <w:style w:styleId="TOCHeading" w:type="paragraph">
@@ -1162,14 +1340,16 @@
     <w:unhideWhenUsed/>
     <w:qFormat/>
     <w:pPr>
-      <w:spacing w:before="240" w:line="259" w:lineRule="auto"/>
+      <w:spacing w:before="240" w:line="276" w:lineRule="auto"/>
+      <w:jc w:val="both"/>
       <w:outlineLvl w:val="9"/>
     </w:pPr>
     <w:rPr>
-      <w:rFonts w:asciiTheme="majorHAnsi" w:cstheme="majorBidi" w:eastAsiaTheme="majorEastAsia" w:hAnsiTheme="majorHAnsi"/>
+      <w:rFonts w:ascii="Times New Roman" w:asciiTheme="majorHAnsi" w:cstheme="majorBidi" w:eastAsia="Times New Roman" w:eastAsiaTheme="majorEastAsia" w:hAnsi="Times New Roman" w:hAnsiTheme="majorHAnsi"/>
       <w:b w:val="0"/>
       <w:bCs w:val="0"/>
-      <w:color w:themeColor="accent1" w:themeShade="BF" w:val="365F91"/>
+      <w:color w:val="000000"/>
+      <w:sz w:val="24"/>
     </w:rPr>
   </w:style>
   <w:style w:type="paragraph" w:customStyle="1" w:styleId="SourceCode">

</xml_diff>